<commit_message>
ALPHADHABI study v2 after external audit: NMDC cost corrected to AED 1.6bn (AD Ports block), exact IHC ownership registry (75.76% direct / ~90.7% anchors), Trojan dual-framing (buyer-outlay vs seller-note) + NAV sensitivity, canonical five-row probability read, protocol holdco expert trio (Accountant + Macro-Policy), SOTP rewired to formulas, Per-Share & Ratios dashboard added
</commit_message>
<xml_diff>
--- a/files/ALPHADHABI_Valuation_Study_10-07-2026_public.docx
+++ b/files/ALPHADHABI_Valuation_Study_10-07-2026_public.docx
@@ -216,7 +216,7 @@
                 <w:color w:val="1C3A36"/>
                 <w:sz w:val="19"/>
               </w:rPr>
-              <w:t>All values are model outputs presented as ranges and distributions because no single number should be relied on. Reported financials are the company’s own disclosure: the audited FY2025 consolidated financial statements (Deloitte, released 10 Feb 2026), the FY2024 audited statements and management discussion &amp; analysis (alphadhabi.com), and the Q1-2026 results release (4 May 2026). One balance-sheet line — FY2025 total borrowings — is a derived figure (FY2024 base plus audited FY2025 financing cash flows) because the borrowings note page was not machine-extractable; it is flagged wherever used. Forward-looking inputs — growth, margins, working-capital absorption, the cost of capital, the multiples and the holdco discount — are the preparer’s judgments and are flagged throughout.</w:t>
+              <w:t>All values are model outputs presented as ranges and distributions because no single number should be relied on. Reported financials are the company’s own disclosure: the audited FY2025 consolidated financial statements (Deloitte, released 10 Feb 2026), the FY2024 audited statements and management discussion &amp; analysis (alphadhabi.com), and the Q1-2026 results release (4 May 2026). One balance-sheet line — FY2025 total borrowings — is a derived figure (FY2024 base plus audited FY2025 financing cash flows) because the borrowings note page was not machine-extractable; it is flagged wherever used, and the derivation is known to omit non-cash additions — lease liabilities recognised at inception (IFRS 16), debt inherited on consolidating NCTH in Jan-2025 (IFRS 3) and FX/accrual effects — so it more likely UNDERstates gross debt than overstates it; the ±AED 5 bn stress columns in §1.9 bound the effect at ±AED 0.5/share, and the exposure is confined to the 15%-weight DCF (the NAV lens builds from book equity and subtracts no debt). Forward-looking inputs — growth, margins, working-capital absorption, the cost of capital, the multiples and the holdco discount — are the preparer’s judgments and are flagged throughout.</w:t>
             </w:r>
           </w:p>
           <w:p>
@@ -577,7 +577,7 @@
                 <w:color w:val="1C3A36"/>
                 <w:sz w:val="18"/>
               </w:rPr>
-              <w:t>AED 18,790 mn (+8%) · AED 3,800 mn total (+81%, fair-value-gain driven; attributable split not yet published)</w:t>
+              <w:t>AED 18,790 mn (+8%) · AED 3,800 mn total (+81%, fair-value-gain driven; attributable split not yet published — derived estimate, flagged: AED 2.0–2.5 bn, spanning the FY25 proportional split (53.3%) and an FV-skew-to-parent scenario (65%))</w:t>
             </w:r>
           </w:p>
         </w:tc>
@@ -805,7 +805,7 @@
                 <w:color w:val="1C3A36"/>
                 <w:sz w:val="18"/>
               </w:rPr>
-              <w:t>IHC-controlled (press-cited ~87%; precise % not re-sourced from a primary filing — flagged); free float thin</w:t>
+              <w:t>IHC Capital Holding 75.76% direct; with West Investments SPV 8.36% and Connaissance Investment 6.56%, disclosed anchor holders total ~90.7% (ADX registry via Mubasher profile) — free float ~9%, thinner than the ~87% press figure the first edition carried</w:t>
             </w:r>
           </w:p>
         </w:tc>
@@ -843,7 +843,7 @@
                 <w:color w:val="1C3A36"/>
                 <w:sz w:val="18"/>
               </w:rPr>
-              <w:t>NMDC buy-up to 76.68% (AED 2.86 bn cash, 2025) · NCTH consolidation (Jan-25) · dividend policy adopted (GA 12 Jan 2026) · buyback running · Q2-26 results due ~Aug 2026</w:t>
+              <w:t>NMDC buy-up to 76.68% — the AD Ports 9.77% block (82.5 mn sh) for AED 1.6 bn, 27-Nov-25 · NCTH consolidation (Jan-25) · dividend policy adopted (GA 12 Jan 2026) · buyback running · Q2-26 results due ~Aug 2026</w:t>
             </w:r>
           </w:p>
         </w:tc>
@@ -2130,7 +2130,7 @@
                 <w:color w:val="1C3A36"/>
                 <w:sz w:val="17"/>
               </w:rPr>
-              <w:t>AED 7.03</w:t>
+              <w:t>AED 6.78</w:t>
             </w:r>
           </w:p>
         </w:tc>
@@ -2203,7 +2203,7 @@
                 <w:color w:val="1C3A36"/>
                 <w:sz w:val="17"/>
               </w:rPr>
-              <w:t>AED 7.07</w:t>
+              <w:t>AED 7.03</w:t>
             </w:r>
           </w:p>
         </w:tc>
@@ -2276,7 +2276,7 @@
                 <w:color w:val="1C3A36"/>
                 <w:sz w:val="17"/>
               </w:rPr>
-              <w:t>AED 6.3–7.1</w:t>
+              <w:t>AED 6.3–7.0</w:t>
             </w:r>
           </w:p>
         </w:tc>
@@ -2381,7 +2381,7 @@
           <w:color w:val="1C3A36"/>
           <w:sz w:val="19"/>
         </w:rPr>
-        <w:t>The construction is deliberately boring: take the parent’s audited FY2025 book equity of AED 60.1 bn, strip out the carrying values of the five assets we can price externally, replace them with their market or transaction marks, and keep everything else at book. Two of the five (Aldar, PureHealth) are liquid ADX large-caps; NMDC and NCTH are quoted but with ADH holding most of the float; Trojan is marked at the AED 4,997 mn ADQ actually paid for 49% in FY2024 — a real price from a sophisticated buyer, aged eighteen months and flagged as such.</w:t>
+        <w:t>The construction is deliberately boring: take the parent’s audited FY2025 book equity of AED 60.1 bn, strip out the carrying values of the five assets we can price externally, replace them with their market or transaction marks, and keep everything else at book. Two of the five (Aldar, PureHealth) are liquid ADX large-caps; NMDC and NCTH are quoted but with ADH holding most of the float; Trojan is marked on the buyer-outlay basis of the FY2024 ADQ transaction — ≈ AED 5.0 bn for 49% (AED 4,997 mn on ADH’s audited FY24 cash-flow proceeds line; ~5,043 mn on ADQ’s side per its FY24 statements and GMTN prospectus) — a real price from a sophisticated buyer, aged eighteen months and flagged as such. The transaction has a second legitimate framing, stated per house rule: ADH’s own disposal note records consideration of AED 3,562 mn for the 49%, with AED 1,456 mn credited to non-controlling interests and ~2,105 mn to retained earnings (the IFRS-10 no-loss-of-control mechanics). On that seller-note basis Trojan at 100% is AED 7.3 bn, not 10.2 — the sensitivity below the table carries it.</w:t>
       </w:r>
     </w:p>
     <w:tbl>
@@ -3015,7 +3015,7 @@
                 <w:color w:val="1C3A36"/>
                 <w:sz w:val="17"/>
               </w:rPr>
-              <w:t>ADQ paid 4,997 mn for 49% (FY24)</w:t>
+              <w:t>ADQ 49% deal, buyer-outlay ≈5.0 bn (FY24)</w:t>
             </w:r>
           </w:p>
         </w:tc>
@@ -3604,6 +3604,20 @@
           <w:sz w:val="17"/>
         </w:rPr>
         <w:t>Figure 1 — The SOTP waterfall: from the parent’s audited book to marked NAV, against the AED 82.2 bn market capitalisation. The gap between the last bar and the mcap line is the holdco premium of §1.7.</w:t>
+      </w:r>
+    </w:p>
+    <w:p>
+      <w:pPr>
+        <w:spacing w:after="120" w:before="0"/>
+      </w:pPr>
+      <w:r>
+        <w:rPr>
+          <w:b w:val="0"/>
+          <w:i w:val="0"/>
+          <w:color w:val="1C3A36"/>
+          <w:sz w:val="19"/>
+        </w:rPr>
+        <w:t>Trojan-basis sensitivity (dual framing): on the seller-note consideration of AED 3,562 mn the 100% value is AED 7.3 bn and the 51% mark AED 3.71 bn — marked NAV falls to AED 72.9 bn, par NAV to 7.29/share and the 15%-discount central to 6.20. Every verdict in this study survives that framing: spot would then sit ~13% above even par NAV rather than ~10%. The buyer-outlay basis is retained as central because it is the price a sophisticated arm’s-length buyer actually committed; both note extractions are logged as an open Fundamental Driver Ledger row.</w:t>
       </w:r>
     </w:p>
     <w:p>
@@ -7487,7 +7501,7 @@
                 <w:color w:val="1C3A36"/>
                 <w:sz w:val="17"/>
               </w:rPr>
-              <w:t>ADQ paid AED 4,997 mn for 49% (audited FY24 cash flow)</w:t>
+              <w:t>ADQ 49% deal: buyer-outlay ≈AED 5.0 bn (ADH FY24 CF 4,997; ADQ-side ~5,043); seller-note 3,562 + 1,456 NCI — dual-framed in §1.1</w:t>
             </w:r>
           </w:p>
         </w:tc>
@@ -10681,7 +10695,7 @@
       <w:tr>
         <w:tc>
           <w:tcPr>
-            <w:tcW w:type="dxa" w:w="6336"/>
+            <w:tcW w:type="dxa" w:w="5184"/>
             <w:shd w:val="clear" w:color="auto" w:fill="EAF0EE"/>
           </w:tcPr>
           <w:p>
@@ -10694,13 +10708,13 @@
                 <w:color w:val="1C3A36"/>
                 <w:sz w:val="18"/>
               </w:rPr>
-              <w:t>Question (T+60 sessions ≈ 3 months)</w:t>
-            </w:r>
-          </w:p>
-        </w:tc>
-        <w:tc>
-          <w:tcPr>
-            <w:tcW w:type="dxa" w:w="2160"/>
+              <w:t>The probability read (T+60 sessions ≈ 3 months)</w:t>
+            </w:r>
+          </w:p>
+        </w:tc>
+        <w:tc>
+          <w:tcPr>
+            <w:tcW w:type="dxa" w:w="3312"/>
             <w:shd w:val="clear" w:color="auto" w:fill="EAF0EE"/>
           </w:tcPr>
           <w:p>
@@ -10713,7 +10727,6 @@
                 <w:color w:val="1C3A36"/>
                 <w:sz w:val="18"/>
               </w:rPr>
-              <w:t>Probability</w:t>
             </w:r>
           </w:p>
         </w:tc>
@@ -10721,7 +10734,7 @@
       <w:tr>
         <w:tc>
           <w:tcPr>
-            <w:tcW w:type="dxa" w:w="6336"/>
+            <w:tcW w:type="dxa" w:w="5184"/>
             <w:shd w:val="clear" w:color="auto" w:fill="F6F1E6"/>
           </w:tcPr>
           <w:p>
@@ -10734,13 +10747,13 @@
                 <w:color w:val="1C3A36"/>
                 <w:sz w:val="18"/>
               </w:rPr>
-              <w:t>Price above AED 8.22 (any gain)?</w:t>
-            </w:r>
-          </w:p>
-        </w:tc>
-        <w:tc>
-          <w:tcPr>
-            <w:tcW w:type="dxa" w:w="2160"/>
+              <w:t>P(price above spot 8.22)</w:t>
+            </w:r>
+          </w:p>
+        </w:tc>
+        <w:tc>
+          <w:tcPr>
+            <w:tcW w:type="dxa" w:w="3312"/>
             <w:shd w:val="clear" w:color="auto" w:fill="F6F1E6"/>
           </w:tcPr>
           <w:p>
@@ -10762,7 +10775,7 @@
       <w:tr>
         <w:tc>
           <w:tcPr>
-            <w:tcW w:type="dxa" w:w="6336"/>
+            <w:tcW w:type="dxa" w:w="5184"/>
           </w:tcPr>
           <w:p>
             <w:pPr>
@@ -10774,13 +10787,13 @@
                 <w:color w:val="1C3A36"/>
                 <w:sz w:val="18"/>
               </w:rPr>
-              <w:t>Up 10%+ (above ~AED 9.04)?</w:t>
-            </w:r>
-          </w:p>
-        </w:tc>
-        <w:tc>
-          <w:tcPr>
-            <w:tcW w:type="dxa" w:w="2160"/>
+              <w:t>P(+10%, above 9.04) vs P(−10%, below 7.40)</w:t>
+            </w:r>
+          </w:p>
+        </w:tc>
+        <w:tc>
+          <w:tcPr>
+            <w:tcW w:type="dxa" w:w="3312"/>
           </w:tcPr>
           <w:p>
             <w:pPr>
@@ -10792,7 +10805,7 @@
                 <w:color w:val="1C3A36"/>
                 <w:sz w:val="18"/>
               </w:rPr>
-              <w:t>30%</w:t>
+              <w:t>30% / 25% — odds 1.2:1 up</w:t>
             </w:r>
           </w:p>
         </w:tc>
@@ -10800,7 +10813,7 @@
       <w:tr>
         <w:tc>
           <w:tcPr>
-            <w:tcW w:type="dxa" w:w="6336"/>
+            <w:tcW w:type="dxa" w:w="5184"/>
           </w:tcPr>
           <w:p>
             <w:pPr>
@@ -10812,13 +10825,13 @@
                 <w:color w:val="1C3A36"/>
                 <w:sz w:val="18"/>
               </w:rPr>
-              <w:t>Down 10%+ (below ~AED 7.40)?</w:t>
-            </w:r>
-          </w:p>
-        </w:tc>
-        <w:tc>
-          <w:tcPr>
-            <w:tcW w:type="dxa" w:w="2160"/>
+              <w:t>Median level and its % move</w:t>
+            </w:r>
+          </w:p>
+        </w:tc>
+        <w:tc>
+          <w:tcPr>
+            <w:tcW w:type="dxa" w:w="3312"/>
           </w:tcPr>
           <w:p>
             <w:pPr>
@@ -10830,7 +10843,7 @@
                 <w:color w:val="1C3A36"/>
                 <w:sz w:val="18"/>
               </w:rPr>
-              <w:t>25%</w:t>
+              <w:t>AED 8.29 (+0.8% — the EIBOR carry, an explained drift)</w:t>
             </w:r>
           </w:p>
         </w:tc>
@@ -10838,7 +10851,7 @@
       <w:tr>
         <w:tc>
           <w:tcPr>
-            <w:tcW w:type="dxa" w:w="6336"/>
+            <w:tcW w:type="dxa" w:w="5184"/>
           </w:tcPr>
           <w:p>
             <w:pPr>
@@ -10850,13 +10863,13 @@
                 <w:color w:val="1C3A36"/>
                 <w:sz w:val="18"/>
               </w:rPr>
-              <w:t>Down 20%+ (below ~AED 6.58)?</w:t>
-            </w:r>
-          </w:p>
-        </w:tc>
-        <w:tc>
-          <w:tcPr>
-            <w:tcW w:type="dxa" w:w="2160"/>
+              <w:t>50% band (25th–75th)</w:t>
+            </w:r>
+          </w:p>
+        </w:tc>
+        <w:tc>
+          <w:tcPr>
+            <w:tcW w:type="dxa" w:w="3312"/>
           </w:tcPr>
           <w:p>
             <w:pPr>
@@ -10868,7 +10881,7 @@
                 <w:color w:val="1C3A36"/>
                 <w:sz w:val="18"/>
               </w:rPr>
-              <w:t>8%</w:t>
+              <w:t>AED 7.42 – 9.27  (90%–113% of spot)</w:t>
             </w:r>
           </w:p>
         </w:tc>
@@ -10876,7 +10889,7 @@
       <w:tr>
         <w:tc>
           <w:tcPr>
-            <w:tcW w:type="dxa" w:w="6336"/>
+            <w:tcW w:type="dxa" w:w="5184"/>
           </w:tcPr>
           <w:p>
             <w:pPr>
@@ -10888,13 +10901,13 @@
                 <w:color w:val="1C3A36"/>
                 <w:sz w:val="18"/>
               </w:rPr>
-              <w:t>Finish within ±10% of spot?</w:t>
-            </w:r>
-          </w:p>
-        </w:tc>
-        <w:tc>
-          <w:tcPr>
-            <w:tcW w:type="dxa" w:w="2160"/>
+              <w:t>Touch(+10%) / touch(−10%) at any point</w:t>
+            </w:r>
+          </w:p>
+        </w:tc>
+        <w:tc>
+          <w:tcPr>
+            <w:tcW w:type="dxa" w:w="3312"/>
           </w:tcPr>
           <w:p>
             <w:pPr>
@@ -10906,7 +10919,7 @@
                 <w:color w:val="1C3A36"/>
                 <w:sz w:val="18"/>
               </w:rPr>
-              <w:t>45%</w:t>
+              <w:t>54% / 46%</w:t>
             </w:r>
           </w:p>
         </w:tc>
@@ -10916,6 +10929,20 @@
       <w:pPr>
         <w:spacing w:after="40"/>
       </w:pPr>
+    </w:p>
+    <w:p>
+      <w:pPr>
+        <w:spacing w:after="120" w:before="0"/>
+      </w:pPr>
+      <w:r>
+        <w:rPr>
+          <w:b w:val="0"/>
+          <w:i w:val="0"/>
+          <w:color w:val="1C3A36"/>
+          <w:sz w:val="18"/>
+        </w:rPr>
+        <w:t>Two supplementary reads outside the canonical five: P(−20%+, below ~6.58) = 8%, and P(finish within ±10% of spot) = 45%.</w:t>
+      </w:r>
     </w:p>
     <w:p>
       <w:pPr>
@@ -12371,7 +12398,7 @@
                 <w:color w:val="1C3A36"/>
                 <w:sz w:val="17"/>
               </w:rPr>
-              <w:t>What do three other methods say?</w:t>
+              <w:t>What do the holdco-trio personas say?</w:t>
             </w:r>
           </w:p>
         </w:tc>
@@ -12389,7 +12416,7 @@
                 <w:color w:val="1C3A36"/>
                 <w:sz w:val="17"/>
               </w:rPr>
-              <w:t>AED 6.3 / 7.03 / 7.07</w:t>
+              <w:t>AED 6.3 / 6.8 / 7.03</w:t>
             </w:r>
           </w:p>
         </w:tc>
@@ -19445,7 +19472,7 @@
                 <w:color w:val="1C3A36"/>
                 <w:sz w:val="15"/>
               </w:rPr>
-              <w:t>66.91% → 76.68% during 2025; cash for added stakes AED 2.86 bn</w:t>
+              <w:t>66.91% → 76.68%: the AD Ports 9.77% block (82.5 mn sh) for AED 1.6 bn, 27-Nov-25</w:t>
             </w:r>
           </w:p>
         </w:tc>
@@ -19463,7 +19490,7 @@
                 <w:color w:val="1C3A36"/>
                 <w:sz w:val="15"/>
               </w:rPr>
-              <w:t>FY25 FS subsidiary notes / SOCIE</w:t>
+              <w:t>ADH + AD Ports releases, 27-Nov-2025</w:t>
             </w:r>
           </w:p>
         </w:tc>
@@ -19481,7 +19508,7 @@
                 <w:color w:val="1C3A36"/>
                 <w:sz w:val="15"/>
               </w:rPr>
-              <w:t>FY25</w:t>
+              <w:t>Nov-25</w:t>
             </w:r>
           </w:p>
         </w:tc>
@@ -21204,7 +21231,7 @@
           <w:color w:val="1C3A36"/>
           <w:sz w:val="24"/>
         </w:rPr>
-        <w:t>C.2  Expert 2 — look-through owner earnings</w:t>
+        <w:t>C.2  Expert 2 — the Accountant</w:t>
       </w:r>
     </w:p>
     <w:p>
@@ -21218,7 +21245,21 @@
           <w:color w:val="1C3A36"/>
           <w:sz w:val="19"/>
         </w:rPr>
-        <w:t>Method. Ignore the consolidated P&amp;L entirely — it adds 100% of NMDC’s profit to 31.6% of Aldar’s via the equity method and then subtracts a blended NCI line, a construction no owner’s economics actually follow. Rebuild the owners’ earnings asset by asset: stake × that asset’s own reported profit, plus a residual for the unlisted book, then capitalize the total at a through-cycle multiple. The build:</w:t>
+        <w:t>Method. The protocol casts an Accountant on every holdco because the instrument IS a set of consolidation choices: this expert refuses every market mark and every scenario until the books themselves have been interrogated, then values the owners’ claim off the cleaned book with a justified price-to-book. The audit comes first, in four exhibits.</w:t>
+      </w:r>
+    </w:p>
+    <w:p>
+      <w:pPr>
+        <w:spacing w:after="120" w:before="0"/>
+      </w:pPr>
+      <w:r>
+        <w:rPr>
+          <w:b w:val="0"/>
+          <w:i w:val="0"/>
+          <w:color w:val="1C3A36"/>
+          <w:sz w:val="19"/>
+        </w:rPr>
+        <w:t>Exhibit 1 — does the consolidated P&amp;L reconcile bottom-up? Rebuild attributable earnings asset by asset (stake × each asset’s own reported profit) as a pure audit device:</w:t>
       </w:r>
     </w:p>
     <w:tbl>
@@ -21341,7 +21382,7 @@
                 <w:color w:val="1C3A36"/>
                 <w:sz w:val="17"/>
               </w:rPr>
-              <w:t>Quality note</w:t>
+              <w:t>Audit note</w:t>
             </w:r>
           </w:p>
         </w:tc>
@@ -21709,7 +21750,7 @@
                 <w:color w:val="1C3A36"/>
                 <w:sz w:val="17"/>
               </w:rPr>
-              <w:t>First full consolidated year</w:t>
+              <w:t>First full consolidated year (IFRS 3, Jan-25)</w:t>
             </w:r>
           </w:p>
         </w:tc>
@@ -21893,7 +21934,7 @@
                 <w:color w:val="1C3A36"/>
                 <w:sz w:val="17"/>
               </w:rPr>
-              <w:t>Residual; reconciles to reported attributable</w:t>
+              <w:t>Residual; closes the reconciliation</w:t>
             </w:r>
           </w:p>
         </w:tc>
@@ -21914,7 +21955,7 @@
                 <w:color w:val="1C3A36"/>
                 <w:sz w:val="17"/>
               </w:rPr>
-              <w:t>Look-through attributable earnings</w:t>
+              <w:t>Look-through attributable</w:t>
             </w:r>
           </w:p>
         </w:tc>
@@ -21992,7 +22033,7 @@
                 <w:color w:val="1C3A36"/>
                 <w:sz w:val="17"/>
               </w:rPr>
-              <w:t>vs reported 8.01 — within 2.5%</w:t>
+              <w:t>vs reported 8.01 — within 2.5%: the P&amp;L is honest</w:t>
             </w:r>
           </w:p>
         </w:tc>
@@ -22014,7 +22055,21 @@
           <w:color w:val="1C3A36"/>
           <w:sz w:val="19"/>
         </w:rPr>
-        <w:t>The reconciliation is this method’s built-in audit: a bottom-up rebuild landing within 2.5% of the reported attributable line says the consolidated figure is not inflated by consolidation artefacts — the earnings are real; the question is only what to pay for them. The multiple: 9.0× base — set below the wrapper’s own 10.3× and above NMDC’s 5.2×, weighting toward Aldar’s 8.6× since Aldar is 30% of the earnings — with a 7.5–10.5× band:</w:t>
+        <w:t>Exhibit 2 — what is the QUALITY of those earnings? FY25 attributable profit of 8.01 bn contains the fair-value-gain engine: +AED 3.15 bn of FVTPL marks. An auditor does not deny those gains; he refuses to capitalize them as recurring. Assuming ~70% sits at parent level (flagged; Driver Ledger), cash-quality attributable earnings ≈ AED 5.81 bn — a cleaned ROAE of 10.3% on the average owners’ book of 56.2 bn, against a 14.3% reported ROAE. Exhibit 3 — the two consolidation findings this audit flags: (i) the FY25 borrowings line is a cash-flow derivation that structurally omits IFRS-16 lease inceptions and the debt inherited when NCTH was consolidated in Jan-25 — gross debt is more likely understated than overstated, which flatters only the DCF leg; (ii) the Trojan mark has two audited framings (buyer-outlay ≈5.0 bn vs seller-note 3,562 + 1,456 NCI transfer) — §1.1 now carries both. Exhibit 4 — the missing Q1-26 attributable split is bridged as a flagged estimate only: AED 2.0–2.5 bn (FY25 proportional split vs an FV-skew-to-parent scenario).</w:t>
+      </w:r>
+    </w:p>
+    <w:p>
+      <w:pPr>
+        <w:spacing w:after="120" w:before="0"/>
+      </w:pPr>
+      <w:r>
+        <w:rPr>
+          <w:b w:val="0"/>
+          <w:i w:val="0"/>
+          <w:color w:val="1C3A36"/>
+          <w:sz w:val="19"/>
+        </w:rPr>
+        <w:t>Valuation. With the book audited, the owners’ claim is worth justified-P/B × book: P/B = (ROAE − g)/(Ke − g), Ke 9.62%, on BVPS AED 6.01:</w:t>
       </w:r>
     </w:p>
     <w:tbl>
@@ -22039,15 +22094,16 @@
         </w:tblBorders>
       </w:tblPr>
       <w:tblGrid>
-        <w:gridCol w:w="2520"/>
-        <w:gridCol w:w="2520"/>
-        <w:gridCol w:w="2520"/>
-        <w:gridCol w:w="2520"/>
+        <w:gridCol w:w="2016"/>
+        <w:gridCol w:w="2016"/>
+        <w:gridCol w:w="2016"/>
+        <w:gridCol w:w="2016"/>
+        <w:gridCol w:w="2016"/>
       </w:tblGrid>
       <w:tr>
         <w:tc>
           <w:tcPr>
-            <w:tcW w:type="dxa" w:w="3744"/>
+            <w:tcW w:type="dxa" w:w="4464"/>
             <w:shd w:val="clear" w:color="auto" w:fill="EAF0EE"/>
           </w:tcPr>
           <w:p>
@@ -22060,13 +22116,13 @@
                 <w:color w:val="1C3A36"/>
                 <w:sz w:val="17"/>
               </w:rPr>
-              <w:t>Scenario</w:t>
-            </w:r>
-          </w:p>
-        </w:tc>
-        <w:tc>
-          <w:tcPr>
-            <w:tcW w:type="dxa" w:w="1944"/>
+              <w:t>Basis</w:t>
+            </w:r>
+          </w:p>
+        </w:tc>
+        <w:tc>
+          <w:tcPr>
+            <w:tcW w:type="dxa" w:w="1080"/>
             <w:shd w:val="clear" w:color="auto" w:fill="EAF0EE"/>
           </w:tcPr>
           <w:p>
@@ -22079,13 +22135,13 @@
                 <w:color w:val="1C3A36"/>
                 <w:sz w:val="17"/>
               </w:rPr>
-              <w:t>Earnings (AED bn)</w:t>
-            </w:r>
-          </w:p>
-        </w:tc>
-        <w:tc>
-          <w:tcPr>
-            <w:tcW w:type="dxa" w:w="1368"/>
+              <w:t>ROAE</w:t>
+            </w:r>
+          </w:p>
+        </w:tc>
+        <w:tc>
+          <w:tcPr>
+            <w:tcW w:type="dxa" w:w="864"/>
             <w:shd w:val="clear" w:color="auto" w:fill="EAF0EE"/>
           </w:tcPr>
           <w:p>
@@ -22098,13 +22154,32 @@
                 <w:color w:val="1C3A36"/>
                 <w:sz w:val="17"/>
               </w:rPr>
-              <w:t>Multiple</w:t>
-            </w:r>
-          </w:p>
-        </w:tc>
-        <w:tc>
-          <w:tcPr>
-            <w:tcW w:type="dxa" w:w="2376"/>
+              <w:t>g</w:t>
+            </w:r>
+          </w:p>
+        </w:tc>
+        <w:tc>
+          <w:tcPr>
+            <w:tcW w:type="dxa" w:w="1512"/>
+            <w:shd w:val="clear" w:color="auto" w:fill="EAF0EE"/>
+          </w:tcPr>
+          <w:p>
+            <w:pPr>
+              <w:spacing w:after="20"/>
+            </w:pPr>
+            <w:r>
+              <w:rPr>
+                <w:b/>
+                <w:color w:val="1C3A36"/>
+                <w:sz w:val="17"/>
+              </w:rPr>
+              <w:t>Justified P/B</w:t>
+            </w:r>
+          </w:p>
+        </w:tc>
+        <w:tc>
+          <w:tcPr>
+            <w:tcW w:type="dxa" w:w="1872"/>
             <w:shd w:val="clear" w:color="auto" w:fill="EAF0EE"/>
           </w:tcPr>
           <w:p>
@@ -22125,7 +22200,7 @@
       <w:tr>
         <w:tc>
           <w:tcPr>
-            <w:tcW w:type="dxa" w:w="3744"/>
+            <w:tcW w:type="dxa" w:w="4464"/>
           </w:tcPr>
           <w:p>
             <w:pPr>
@@ -22137,61 +22212,79 @@
                 <w:color w:val="1C3A36"/>
                 <w:sz w:val="17"/>
               </w:rPr>
-              <w:t>Low — de-rated multiple</w:t>
-            </w:r>
-          </w:p>
-        </w:tc>
-        <w:tc>
-          <w:tcPr>
-            <w:tcW w:type="dxa" w:w="1944"/>
-          </w:tcPr>
-          <w:p>
-            <w:pPr>
-              <w:spacing w:after="20"/>
-              <w:jc w:val="right"/>
-            </w:pPr>
-            <w:r>
-              <w:rPr>
-                <w:color w:val="1C3A36"/>
-                <w:sz w:val="17"/>
-              </w:rPr>
-              <w:t>7.81</w:t>
-            </w:r>
-          </w:p>
-        </w:tc>
-        <w:tc>
-          <w:tcPr>
-            <w:tcW w:type="dxa" w:w="1368"/>
-          </w:tcPr>
-          <w:p>
-            <w:pPr>
-              <w:spacing w:after="20"/>
-              <w:jc w:val="right"/>
-            </w:pPr>
-            <w:r>
-              <w:rPr>
-                <w:color w:val="1C3A36"/>
-                <w:sz w:val="17"/>
-              </w:rPr>
-              <w:t>7.5×</w:t>
-            </w:r>
-          </w:p>
-        </w:tc>
-        <w:tc>
-          <w:tcPr>
-            <w:tcW w:type="dxa" w:w="2376"/>
-          </w:tcPr>
-          <w:p>
-            <w:pPr>
-              <w:spacing w:after="20"/>
-              <w:jc w:val="right"/>
-            </w:pPr>
-            <w:r>
-              <w:rPr>
-                <w:color w:val="1C3A36"/>
-                <w:sz w:val="17"/>
-              </w:rPr>
-              <w:t>5.86</w:t>
+              <w:t>Audit-haircut (cleaned ROAE −50bp for the debt finding; book −5%)</w:t>
+            </w:r>
+          </w:p>
+        </w:tc>
+        <w:tc>
+          <w:tcPr>
+            <w:tcW w:type="dxa" w:w="1080"/>
+          </w:tcPr>
+          <w:p>
+            <w:pPr>
+              <w:spacing w:after="20"/>
+              <w:jc w:val="right"/>
+            </w:pPr>
+            <w:r>
+              <w:rPr>
+                <w:color w:val="1C3A36"/>
+                <w:sz w:val="17"/>
+              </w:rPr>
+              <w:t>9.8%</w:t>
+            </w:r>
+          </w:p>
+        </w:tc>
+        <w:tc>
+          <w:tcPr>
+            <w:tcW w:type="dxa" w:w="864"/>
+          </w:tcPr>
+          <w:p>
+            <w:pPr>
+              <w:spacing w:after="20"/>
+              <w:jc w:val="right"/>
+            </w:pPr>
+            <w:r>
+              <w:rPr>
+                <w:color w:val="1C3A36"/>
+                <w:sz w:val="17"/>
+              </w:rPr>
+              <w:t>3.5%</w:t>
+            </w:r>
+          </w:p>
+        </w:tc>
+        <w:tc>
+          <w:tcPr>
+            <w:tcW w:type="dxa" w:w="1512"/>
+          </w:tcPr>
+          <w:p>
+            <w:pPr>
+              <w:spacing w:after="20"/>
+              <w:jc w:val="right"/>
+            </w:pPr>
+            <w:r>
+              <w:rPr>
+                <w:color w:val="1C3A36"/>
+                <w:sz w:val="17"/>
+              </w:rPr>
+              <w:t>1.04</w:t>
+            </w:r>
+          </w:p>
+        </w:tc>
+        <w:tc>
+          <w:tcPr>
+            <w:tcW w:type="dxa" w:w="1872"/>
+          </w:tcPr>
+          <w:p>
+            <w:pPr>
+              <w:spacing w:after="20"/>
+              <w:jc w:val="right"/>
+            </w:pPr>
+            <w:r>
+              <w:rPr>
+                <w:color w:val="1C3A36"/>
+                <w:sz w:val="17"/>
+              </w:rPr>
+              <w:t>5.91</w:t>
             </w:r>
           </w:p>
         </w:tc>
@@ -22199,7 +22292,7 @@
       <w:tr>
         <w:tc>
           <w:tcPr>
-            <w:tcW w:type="dxa" w:w="3744"/>
+            <w:tcW w:type="dxa" w:w="4464"/>
             <w:shd w:val="clear" w:color="auto" w:fill="F6F1E6"/>
           </w:tcPr>
           <w:p>
@@ -22212,13 +22305,13 @@
                 <w:color w:val="1C3A36"/>
                 <w:sz w:val="17"/>
               </w:rPr>
-              <w:t>Base — through-cycle</w:t>
-            </w:r>
-          </w:p>
-        </w:tc>
-        <w:tc>
-          <w:tcPr>
-            <w:tcW w:type="dxa" w:w="1944"/>
+              <w:t>Base — cleaned ROAE, cash-quality earnings only</w:t>
+            </w:r>
+          </w:p>
+        </w:tc>
+        <w:tc>
+          <w:tcPr>
+            <w:tcW w:type="dxa" w:w="1080"/>
             <w:shd w:val="clear" w:color="auto" w:fill="F6F1E6"/>
           </w:tcPr>
           <w:p>
@@ -22232,13 +22325,13 @@
                 <w:color w:val="1C3A36"/>
                 <w:sz w:val="17"/>
               </w:rPr>
-              <w:t>7.81</w:t>
-            </w:r>
-          </w:p>
-        </w:tc>
-        <w:tc>
-          <w:tcPr>
-            <w:tcW w:type="dxa" w:w="1368"/>
+              <w:t>10.3%</w:t>
+            </w:r>
+          </w:p>
+        </w:tc>
+        <w:tc>
+          <w:tcPr>
+            <w:tcW w:type="dxa" w:w="864"/>
             <w:shd w:val="clear" w:color="auto" w:fill="F6F1E6"/>
           </w:tcPr>
           <w:p>
@@ -22252,13 +22345,13 @@
                 <w:color w:val="1C3A36"/>
                 <w:sz w:val="17"/>
               </w:rPr>
-              <w:t>9.0×</w:t>
-            </w:r>
-          </w:p>
-        </w:tc>
-        <w:tc>
-          <w:tcPr>
-            <w:tcW w:type="dxa" w:w="2376"/>
+              <w:t>4.0%</w:t>
+            </w:r>
+          </w:p>
+        </w:tc>
+        <w:tc>
+          <w:tcPr>
+            <w:tcW w:type="dxa" w:w="1512"/>
             <w:shd w:val="clear" w:color="auto" w:fill="F6F1E6"/>
           </w:tcPr>
           <w:p>
@@ -22272,7 +22365,27 @@
                 <w:color w:val="1C3A36"/>
                 <w:sz w:val="17"/>
               </w:rPr>
-              <w:t>7.03</w:t>
+              <w:t>1.13</w:t>
+            </w:r>
+          </w:p>
+        </w:tc>
+        <w:tc>
+          <w:tcPr>
+            <w:tcW w:type="dxa" w:w="1872"/>
+            <w:shd w:val="clear" w:color="auto" w:fill="F6F1E6"/>
+          </w:tcPr>
+          <w:p>
+            <w:pPr>
+              <w:spacing w:after="20"/>
+              <w:jc w:val="right"/>
+            </w:pPr>
+            <w:r>
+              <w:rPr>
+                <w:b/>
+                <w:color w:val="1C3A36"/>
+                <w:sz w:val="17"/>
+              </w:rPr>
+              <w:t>6.78</w:t>
             </w:r>
           </w:p>
         </w:tc>
@@ -22280,7 +22393,7 @@
       <w:tr>
         <w:tc>
           <w:tcPr>
-            <w:tcW w:type="dxa" w:w="3744"/>
+            <w:tcW w:type="dxa" w:w="4464"/>
           </w:tcPr>
           <w:p>
             <w:pPr>
@@ -22292,209 +22405,79 @@
                 <w:color w:val="1C3A36"/>
                 <w:sz w:val="17"/>
               </w:rPr>
-              <w:t>High — quality re-rate</w:t>
-            </w:r>
-          </w:p>
-        </w:tc>
-        <w:tc>
-          <w:tcPr>
-            <w:tcW w:type="dxa" w:w="1944"/>
-          </w:tcPr>
-          <w:p>
-            <w:pPr>
-              <w:spacing w:after="20"/>
-              <w:jc w:val="right"/>
-            </w:pPr>
-            <w:r>
-              <w:rPr>
-                <w:color w:val="1C3A36"/>
-                <w:sz w:val="17"/>
-              </w:rPr>
-              <w:t>7.81</w:t>
-            </w:r>
-          </w:p>
-        </w:tc>
-        <w:tc>
-          <w:tcPr>
-            <w:tcW w:type="dxa" w:w="1368"/>
-          </w:tcPr>
-          <w:p>
-            <w:pPr>
-              <w:spacing w:after="20"/>
-              <w:jc w:val="right"/>
-            </w:pPr>
-            <w:r>
-              <w:rPr>
-                <w:color w:val="1C3A36"/>
-                <w:sz w:val="17"/>
-              </w:rPr>
-              <w:t>10.5×</w:t>
-            </w:r>
-          </w:p>
-        </w:tc>
-        <w:tc>
-          <w:tcPr>
-            <w:tcW w:type="dxa" w:w="2376"/>
-          </w:tcPr>
-          <w:p>
-            <w:pPr>
-              <w:spacing w:after="20"/>
-              <w:jc w:val="right"/>
-            </w:pPr>
-            <w:r>
-              <w:rPr>
-                <w:color w:val="1C3A36"/>
-                <w:sz w:val="17"/>
-              </w:rPr>
-              <w:t>8.20</w:t>
-            </w:r>
-          </w:p>
-        </w:tc>
-      </w:tr>
-      <w:tr>
-        <w:tc>
-          <w:tcPr>
-            <w:tcW w:type="dxa" w:w="3744"/>
-          </w:tcPr>
-          <w:p>
-            <w:pPr>
-              <w:spacing w:after="20"/>
-            </w:pPr>
-            <w:r>
-              <w:rPr>
-                <w:b/>
-                <w:color w:val="1C3A36"/>
-                <w:sz w:val="17"/>
-              </w:rPr>
-              <w:t>Stress — NMDC run-rate halves</w:t>
-            </w:r>
-          </w:p>
-        </w:tc>
-        <w:tc>
-          <w:tcPr>
-            <w:tcW w:type="dxa" w:w="1944"/>
-          </w:tcPr>
-          <w:p>
-            <w:pPr>
-              <w:spacing w:after="20"/>
-              <w:jc w:val="right"/>
-            </w:pPr>
-            <w:r>
-              <w:rPr>
-                <w:color w:val="1C3A36"/>
-                <w:sz w:val="17"/>
-              </w:rPr>
-              <w:t>6.42</w:t>
-            </w:r>
-          </w:p>
-        </w:tc>
-        <w:tc>
-          <w:tcPr>
-            <w:tcW w:type="dxa" w:w="1368"/>
-          </w:tcPr>
-          <w:p>
-            <w:pPr>
-              <w:spacing w:after="20"/>
-              <w:jc w:val="right"/>
-            </w:pPr>
-            <w:r>
-              <w:rPr>
-                <w:color w:val="1C3A36"/>
-                <w:sz w:val="17"/>
-              </w:rPr>
-              <w:t>9.0×</w:t>
-            </w:r>
-          </w:p>
-        </w:tc>
-        <w:tc>
-          <w:tcPr>
-            <w:tcW w:type="dxa" w:w="2376"/>
-          </w:tcPr>
-          <w:p>
-            <w:pPr>
-              <w:spacing w:after="20"/>
-              <w:jc w:val="right"/>
-            </w:pPr>
-            <w:r>
-              <w:rPr>
-                <w:color w:val="1C3A36"/>
-                <w:sz w:val="17"/>
-              </w:rPr>
-              <w:t>5.78</w:t>
-            </w:r>
-          </w:p>
-        </w:tc>
-      </w:tr>
-      <w:tr>
-        <w:tc>
-          <w:tcPr>
-            <w:tcW w:type="dxa" w:w="3744"/>
-          </w:tcPr>
-          <w:p>
-            <w:pPr>
-              <w:spacing w:after="20"/>
-            </w:pPr>
-            <w:r>
-              <w:rPr>
-                <w:b/>
-                <w:color w:val="1C3A36"/>
-                <w:sz w:val="17"/>
-              </w:rPr>
-              <w:t>Stress — NMDC halves + multiple de-rates</w:t>
-            </w:r>
-          </w:p>
-        </w:tc>
-        <w:tc>
-          <w:tcPr>
-            <w:tcW w:type="dxa" w:w="1944"/>
-          </w:tcPr>
-          <w:p>
-            <w:pPr>
-              <w:spacing w:after="20"/>
-              <w:jc w:val="right"/>
-            </w:pPr>
-            <w:r>
-              <w:rPr>
-                <w:color w:val="1C3A36"/>
-                <w:sz w:val="17"/>
-              </w:rPr>
-              <w:t>6.42</w:t>
-            </w:r>
-          </w:p>
-        </w:tc>
-        <w:tc>
-          <w:tcPr>
-            <w:tcW w:type="dxa" w:w="1368"/>
-          </w:tcPr>
-          <w:p>
-            <w:pPr>
-              <w:spacing w:after="20"/>
-              <w:jc w:val="right"/>
-            </w:pPr>
-            <w:r>
-              <w:rPr>
-                <w:color w:val="1C3A36"/>
-                <w:sz w:val="17"/>
-              </w:rPr>
-              <w:t>7.5×</w:t>
-            </w:r>
-          </w:p>
-        </w:tc>
-        <w:tc>
-          <w:tcPr>
-            <w:tcW w:type="dxa" w:w="2376"/>
-          </w:tcPr>
-          <w:p>
-            <w:pPr>
-              <w:spacing w:after="20"/>
-              <w:jc w:val="right"/>
-            </w:pPr>
-            <w:r>
-              <w:rPr>
-                <w:color w:val="1C3A36"/>
-                <w:sz w:val="17"/>
-              </w:rPr>
-              <w:t>4.82</w:t>
+              <w:t>Reported ROAE accepted, capped at par-NAV/book</w:t>
+            </w:r>
+          </w:p>
+        </w:tc>
+        <w:tc>
+          <w:tcPr>
+            <w:tcW w:type="dxa" w:w="1080"/>
+          </w:tcPr>
+          <w:p>
+            <w:pPr>
+              <w:spacing w:after="20"/>
+              <w:jc w:val="right"/>
+            </w:pPr>
+            <w:r>
+              <w:rPr>
+                <w:color w:val="1C3A36"/>
+                <w:sz w:val="17"/>
+              </w:rPr>
+              <w:t>14.3%</w:t>
+            </w:r>
+          </w:p>
+        </w:tc>
+        <w:tc>
+          <w:tcPr>
+            <w:tcW w:type="dxa" w:w="864"/>
+          </w:tcPr>
+          <w:p>
+            <w:pPr>
+              <w:spacing w:after="20"/>
+              <w:jc w:val="right"/>
+            </w:pPr>
+            <w:r>
+              <w:rPr>
+                <w:color w:val="1C3A36"/>
+                <w:sz w:val="17"/>
+              </w:rPr>
+              <w:t>4.5%</w:t>
+            </w:r>
+          </w:p>
+        </w:tc>
+        <w:tc>
+          <w:tcPr>
+            <w:tcW w:type="dxa" w:w="1512"/>
+          </w:tcPr>
+          <w:p>
+            <w:pPr>
+              <w:spacing w:after="20"/>
+              <w:jc w:val="right"/>
+            </w:pPr>
+            <w:r>
+              <w:rPr>
+                <w:color w:val="1C3A36"/>
+                <w:sz w:val="17"/>
+              </w:rPr>
+              <w:t>1.24</w:t>
+            </w:r>
+          </w:p>
+        </w:tc>
+        <w:tc>
+          <w:tcPr>
+            <w:tcW w:type="dxa" w:w="1872"/>
+          </w:tcPr>
+          <w:p>
+            <w:pPr>
+              <w:spacing w:after="20"/>
+              <w:jc w:val="right"/>
+            </w:pPr>
+            <w:r>
+              <w:rPr>
+                <w:color w:val="1C3A36"/>
+                <w:sz w:val="17"/>
+              </w:rPr>
+              <w:t>7.44</w:t>
             </w:r>
           </w:p>
         </w:tc>
@@ -22516,7 +22499,7 @@
           <w:color w:val="1C3A36"/>
           <w:sz w:val="19"/>
         </w:rPr>
-        <w:t>The stress rows are the point: Expert 2’s base is one NMDC disappointment away from the low 6s, which is why this expert calls AED 7.03 an earnings ceiling under current information, not a midpoint. Where this expert diverges from the house: the FV-gain engine (+3.2 bn FVTPL in FY25) is deliberately excluded — unrealized marks on a financial book are balance-sheet compounding, not earnings power, and belong in Expert 1’s lens, not this one. Falsification: if NMDC’s Q1-26 halving proves the new run-rate rather than a normalization dip, the 2.78 line falls ~1.2 bn and the base drops toward 5.8; conversely two quarters of NMDC EPS back above 0.80 retires the stress rows.</w:t>
+        <w:t>Base AED 6.78 (range 5.91–7.44). Where this expert diverges from the house: no credit for the look-through multiple at all — the reconciliation in Exhibit 1 is a truth test, not a lens; capitalizing earnings the marks already price would double-count Aldar’s terminal value. Falsification: two consecutive quarters in which the FV-gain engine converts to cash (disposals at or above the marks) would justify migrating from cleaned to reported ROAE, moving the base toward 7.4; an NCTH-scale restatement or a borrowings note materially above the derived 41.4 bn moves it toward the haircut row.</w:t>
       </w:r>
     </w:p>
     <w:p>
@@ -22530,7 +22513,7 @@
           <w:color w:val="1C3A36"/>
           <w:sz w:val="24"/>
         </w:rPr>
-        <w:t>C.3  Expert 3 — the regime scenario tree</w:t>
+        <w:t>C.3  Expert 3 — Macro-Policy</w:t>
       </w:r>
     </w:p>
     <w:p>
@@ -22544,7 +22527,7 @@
           <w:color w:val="1C3A36"/>
           <w:sz w:val="19"/>
         </w:rPr>
-        <w:t>Method. This name is not priced quarter to quarter by cash flows; it is priced by which regime the Gulf is in — the 2026 price series says so directly (a −45% peak-to-trough war leg and a +20% ceasefire leg inside four months, with no change in the assets). So model the regimes, not the spreadsheet: three states over ~12 months, each with its own valuation logic, probability-weighted. State probabilities were set before the 7–8 Jul re-escalation and are retained — the 25% war-stress weight was chosen precisely to cover weeks like this one:</w:t>
+        <w:t>Method. The protocol’s third holdco persona prices the policy state, not the spreadsheet: for a dirham-pegged holding whose assets are duration-heavy (a developer, a hospital platform, a hotel platform) and whose pipeline is fiscal (state-linked construction and dredging), four policy channels dominate — the Fed/CBUAE rate path the peg imports, the UAE DMTT 15% corporate-tax glide (FY25 ETR 10.2% → 15%), the oil-fiscal pulse behind Abu Dhabi’s project pipeline, and index/flows mechanics on a ~9% free float. The 2026 tape says the state dominates: a −45% war leg and a +20% ceasefire leg inside four months, with no change in the assets. Three policy states over ~12 months:</w:t>
       </w:r>
     </w:p>
     <w:tbl>
@@ -22579,7 +22562,7 @@
       <w:tr>
         <w:tc>
           <w:tcPr>
-            <w:tcW w:type="dxa" w:w="2160"/>
+            <w:tcW w:type="dxa" w:w="1944"/>
             <w:shd w:val="clear" w:color="auto" w:fill="EAF0EE"/>
           </w:tcPr>
           <w:p>
@@ -22617,7 +22600,7 @@
         </w:tc>
         <w:tc>
           <w:tcPr>
-            <w:tcW w:type="dxa" w:w="3240"/>
+            <w:tcW w:type="dxa" w:w="3456"/>
             <w:shd w:val="clear" w:color="auto" w:fill="EAF0EE"/>
           </w:tcPr>
           <w:p>
@@ -22630,13 +22613,13 @@
                 <w:color w:val="1C3A36"/>
                 <w:sz w:val="16"/>
               </w:rPr>
-              <w:t>What happens</w:t>
-            </w:r>
-          </w:p>
-        </w:tc>
-        <w:tc>
-          <w:tcPr>
-            <w:tcW w:type="dxa" w:w="2520"/>
+              <w:t>Policy configuration</w:t>
+            </w:r>
+          </w:p>
+        </w:tc>
+        <w:tc>
+          <w:tcPr>
+            <w:tcW w:type="dxa" w:w="2664"/>
             <w:shd w:val="clear" w:color="auto" w:fill="EAF0EE"/>
           </w:tcPr>
           <w:p>
@@ -22695,7 +22678,7 @@
       <w:tr>
         <w:tc>
           <w:tcPr>
-            <w:tcW w:type="dxa" w:w="2160"/>
+            <w:tcW w:type="dxa" w:w="1944"/>
           </w:tcPr>
           <w:p>
             <w:pPr>
@@ -22707,7 +22690,7 @@
                 <w:color w:val="1C3A36"/>
                 <w:sz w:val="16"/>
               </w:rPr>
-              <w:t>A — risk-on, premium defended</w:t>
+              <w:t>A — easing + fiscal expansion</w:t>
             </w:r>
           </w:p>
         </w:tc>
@@ -22731,7 +22714,7 @@
         </w:tc>
         <w:tc>
           <w:tcPr>
-            <w:tcW w:type="dxa" w:w="3240"/>
+            <w:tcW w:type="dxa" w:w="3456"/>
           </w:tcPr>
           <w:p>
             <w:pPr>
@@ -22743,13 +22726,13 @@
                 <w:color w:val="1C3A36"/>
                 <w:sz w:val="16"/>
               </w:rPr>
-              <w:t>De-escalation holds; buyback and IHC deal flow continue; FV gains keep printing</w:t>
-            </w:r>
-          </w:p>
-        </w:tc>
-        <w:tc>
-          <w:tcPr>
-            <w:tcW w:type="dxa" w:w="2520"/>
+              <w:t>Fed cuts ~100bp through mid-27; the peg imports them; oil holds the fiscal pulse; DMTT drag absorbed by growth</w:t>
+            </w:r>
+          </w:p>
+        </w:tc>
+        <w:tc>
+          <w:tcPr>
+            <w:tcW w:type="dxa" w:w="2664"/>
           </w:tcPr>
           <w:p>
             <w:pPr>
@@ -22761,7 +22744,7 @@
                 <w:color w:val="1C3A36"/>
                 <w:sz w:val="16"/>
               </w:rPr>
-              <w:t>Spot holds a modest premium: 8.22 × 1.05</w:t>
+              <w:t>Ke −100bp lifts the duration-heavy marks ~+8% look-through; premium defended</w:t>
             </w:r>
           </w:p>
         </w:tc>
@@ -22779,7 +22762,7 @@
                 <w:color w:val="1C3A36"/>
                 <w:sz w:val="16"/>
               </w:rPr>
-              <w:t>AED 8.63</w:t>
+              <w:t>AED 8.20</w:t>
             </w:r>
           </w:p>
         </w:tc>
@@ -22797,7 +22780,7 @@
                 <w:color w:val="1C3A36"/>
                 <w:sz w:val="16"/>
               </w:rPr>
-              <w:t>3.02</w:t>
+              <w:t>2.87</w:t>
             </w:r>
           </w:p>
         </w:tc>
@@ -22805,7 +22788,7 @@
       <w:tr>
         <w:tc>
           <w:tcPr>
-            <w:tcW w:type="dxa" w:w="2160"/>
+            <w:tcW w:type="dxa" w:w="1944"/>
           </w:tcPr>
           <w:p>
             <w:pPr>
@@ -22817,7 +22800,7 @@
                 <w:color w:val="1C3A36"/>
                 <w:sz w:val="16"/>
               </w:rPr>
-              <w:t>B — NAV gravity</w:t>
+              <w:t>B — hold / neutral</w:t>
             </w:r>
           </w:p>
         </w:tc>
@@ -22841,7 +22824,7 @@
         </w:tc>
         <w:tc>
           <w:tcPr>
-            <w:tcW w:type="dxa" w:w="3240"/>
+            <w:tcW w:type="dxa" w:w="3456"/>
           </w:tcPr>
           <w:p>
             <w:pPr>
@@ -22853,13 +22836,13 @@
                 <w:color w:val="1C3A36"/>
                 <w:sz w:val="16"/>
               </w:rPr>
-              <w:t>No crisis, but flat attributable EPS for two more quarters; the compounder story loses urgency</w:t>
-            </w:r>
-          </w:p>
-        </w:tc>
-        <w:tc>
-          <w:tcPr>
-            <w:tcW w:type="dxa" w:w="2520"/>
+              <w:t>Higher-for-longer; DMTT glide bites (~0.4 bn attributable by FY28); no crisis, no catalyst</w:t>
+            </w:r>
+          </w:p>
+        </w:tc>
+        <w:tc>
+          <w:tcPr>
+            <w:tcW w:type="dxa" w:w="2664"/>
           </w:tcPr>
           <w:p>
             <w:pPr>
@@ -22871,7 +22854,7 @@
                 <w:color w:val="1C3A36"/>
                 <w:sz w:val="16"/>
               </w:rPr>
-              <w:t>Price drifts to a small premium over discounted NAV: 6.32 × 1.05</w:t>
+              <w:t>Discounted-NAV gravity + carry: 6.32 × ~1.09</w:t>
             </w:r>
           </w:p>
         </w:tc>
@@ -22889,7 +22872,7 @@
                 <w:color w:val="1C3A36"/>
                 <w:sz w:val="16"/>
               </w:rPr>
-              <w:t>AED 6.64</w:t>
+              <w:t>AED 6.90</w:t>
             </w:r>
           </w:p>
         </w:tc>
@@ -22907,7 +22890,7 @@
                 <w:color w:val="1C3A36"/>
                 <w:sz w:val="16"/>
               </w:rPr>
-              <w:t>2.66</w:t>
+              <w:t>2.76</w:t>
             </w:r>
           </w:p>
         </w:tc>
@@ -22915,7 +22898,7 @@
       <w:tr>
         <w:tc>
           <w:tcPr>
-            <w:tcW w:type="dxa" w:w="2160"/>
+            <w:tcW w:type="dxa" w:w="1944"/>
           </w:tcPr>
           <w:p>
             <w:pPr>
@@ -22927,7 +22910,7 @@
                 <w:color w:val="1C3A36"/>
                 <w:sz w:val="16"/>
               </w:rPr>
-              <w:t>C — war stress</w:t>
+              <w:t>C — war-fiscal stress</w:t>
             </w:r>
           </w:p>
         </w:tc>
@@ -22951,7 +22934,7 @@
         </w:tc>
         <w:tc>
           <w:tcPr>
-            <w:tcW w:type="dxa" w:w="3240"/>
+            <w:tcW w:type="dxa" w:w="3456"/>
           </w:tcPr>
           <w:p>
             <w:pPr>
@@ -22963,13 +22946,13 @@
                 <w:color w:val="1C3A36"/>
                 <w:sz w:val="16"/>
               </w:rPr>
-              <w:t>Re-escalation persists; Hormuz risk premium stays in every ADX mark; multiple and marks compress together</w:t>
-            </w:r>
-          </w:p>
-        </w:tc>
-        <w:tc>
-          <w:tcPr>
-            <w:tcW w:type="dxa" w:w="2520"/>
+              <w:t>Re-escalation persists; Hormuz premium in every ADX mark; fiscal pipeline pauses</w:t>
+            </w:r>
+          </w:p>
+        </w:tc>
+        <w:tc>
+          <w:tcPr>
+            <w:tcW w:type="dxa" w:w="2664"/>
           </w:tcPr>
           <w:p>
             <w:pPr>
@@ -22999,7 +22982,7 @@
                 <w:color w:val="1C3A36"/>
                 <w:sz w:val="16"/>
               </w:rPr>
-              <w:t>AED 5.58</w:t>
+              <w:t>AED 5.60</w:t>
             </w:r>
           </w:p>
         </w:tc>
@@ -23017,7 +23000,7 @@
                 <w:color w:val="1C3A36"/>
                 <w:sz w:val="16"/>
               </w:rPr>
-              <w:t>1.39</w:t>
+              <w:t>1.40</w:t>
             </w:r>
           </w:p>
         </w:tc>
@@ -23025,7 +23008,7 @@
       <w:tr>
         <w:tc>
           <w:tcPr>
-            <w:tcW w:type="dxa" w:w="2160"/>
+            <w:tcW w:type="dxa" w:w="1944"/>
             <w:shd w:val="clear" w:color="auto" w:fill="F6F1E6"/>
           </w:tcPr>
           <w:p>
@@ -23063,7 +23046,7 @@
         </w:tc>
         <w:tc>
           <w:tcPr>
-            <w:tcW w:type="dxa" w:w="3240"/>
+            <w:tcW w:type="dxa" w:w="3456"/>
             <w:shd w:val="clear" w:color="auto" w:fill="F6F1E6"/>
           </w:tcPr>
           <w:p>
@@ -23082,7 +23065,7 @@
         </w:tc>
         <w:tc>
           <w:tcPr>
-            <w:tcW w:type="dxa" w:w="2520"/>
+            <w:tcW w:type="dxa" w:w="2664"/>
             <w:shd w:val="clear" w:color="auto" w:fill="F6F1E6"/>
           </w:tcPr>
           <w:p>
@@ -23115,7 +23098,7 @@
                 <w:color w:val="1C3A36"/>
                 <w:sz w:val="16"/>
               </w:rPr>
-              <w:t>AED 7.07</w:t>
+              <w:t>AED 7.03</w:t>
             </w:r>
           </w:p>
         </w:tc>
@@ -23135,7 +23118,7 @@
                 <w:color w:val="1C3A36"/>
                 <w:sz w:val="16"/>
               </w:rPr>
-              <w:t>= 3.02+2.66+1.39</w:t>
+              <w:t>= 2.87+2.76+1.40</w:t>
             </w:r>
           </w:p>
         </w:tc>
@@ -23157,7 +23140,7 @@
           <w:color w:val="1C3A36"/>
           <w:sz w:val="19"/>
         </w:rPr>
-        <w:t>Two features of the tree deserve emphasis. First, the states are not symmetric around spot: even the friendly state yields only +5%, because in this expert’s read the pre-war shelf (AED 9–12) required a growth narrative that two years of falling EPS no longer supports — de-escalation removes a tail, it does not restore 2024. Second, the tree’s centre of gravity is state B: the most likely world is the boring one, where nothing breaks and the price grinds toward the marks. Sensitivity of the weighted value to the opinion embedded in the weights:</w:t>
+        <w:t>Two features deserve emphasis. First, even the friendly state yields only AED 8.20 — easing removes a tail and lifts the marks, but it cannot restore the 2024 growth narrative that two years of falling attributable EPS retired. Second, the DMTT glide is the quiet, certain drag: it is already in the DCF’s tax path and in state B here; it never appears in the bull case because policy certainty is not a catalyst. Sensitivity of the weighted value to the weights:</w:t>
       </w:r>
     </w:p>
     <w:tbl>
@@ -23260,7 +23243,7 @@
                 <w:color w:val="1C3A36"/>
                 <w:sz w:val="17"/>
               </w:rPr>
-              <w:t>50 / 35 / 15 — durable ceasefire, Hormuz open a full quarter</w:t>
+              <w:t>50 / 35 / 15 — durable ceasefire + Fed cutting</w:t>
             </w:r>
           </w:p>
         </w:tc>
@@ -23278,7 +23261,7 @@
                 <w:color w:val="1C3A36"/>
                 <w:sz w:val="17"/>
               </w:rPr>
-              <w:t>7.48</w:t>
+              <w:t>7.36</w:t>
             </w:r>
           </w:p>
         </w:tc>
@@ -23337,7 +23320,7 @@
                 <w:color w:val="1C3A36"/>
                 <w:sz w:val="17"/>
               </w:rPr>
-              <w:t>7.07</w:t>
+              <w:t>7.03</w:t>
             </w:r>
           </w:p>
         </w:tc>
@@ -23433,7 +23416,7 @@
                 <w:color w:val="1C3A36"/>
                 <w:sz w:val="17"/>
               </w:rPr>
-              <w:t>15 / 35 / 50 — sustained closure scenario</w:t>
+              <w:t>15 / 35 / 50 — sustained closure + higher-for-longer</w:t>
             </w:r>
           </w:p>
         </w:tc>
@@ -23451,7 +23434,7 @@
                 <w:color w:val="1C3A36"/>
                 <w:sz w:val="17"/>
               </w:rPr>
-              <w:t>6.41</w:t>
+              <w:t>6.44</w:t>
             </w:r>
           </w:p>
         </w:tc>
@@ -23491,7 +23474,7 @@
           <w:color w:val="1C3A36"/>
           <w:sz w:val="19"/>
         </w:rPr>
-        <w:t>Note what the last row says: even a half-weight on the war state keeps this method above AED 6.4, because the stress state is anchored to marked NAV rather than to panic prices — the tree prices regimes, it does not extrapolate drawdowns. Falsification: the weights are the opinion; a durable ceasefire with Hormuz open for a full quarter moves the value to ~7.5, while a second Hormuz closure of a month or more justifies the 6.4 row.</w:t>
+        <w:t>Note the last row: even a half-weight on the stress state keeps this method above AED 6.4, because the stress state is anchored to marked NAV rather than to panic prices. Falsification: the weights are the opinion — a durable ceasefire with the Fed cutting moves the value to ~7.4; a second Hormuz closure of a month or more, or a UAE decision to accelerate Pillar-Two top-ups, justifies the 6.4 row.</w:t>
       </w:r>
     </w:p>
     <w:p>
@@ -23758,7 +23741,7 @@
                 <w:color w:val="1C3A36"/>
                 <w:sz w:val="17"/>
               </w:rPr>
-              <w:t>Look-through earnings</w:t>
+              <w:t>Accountant — cleaned-book justified P/B</w:t>
             </w:r>
           </w:p>
         </w:tc>
@@ -23776,7 +23759,7 @@
                 <w:color w:val="1C3A36"/>
                 <w:sz w:val="17"/>
               </w:rPr>
-              <w:t>7.03</w:t>
+              <w:t>6.78</w:t>
             </w:r>
           </w:p>
         </w:tc>
@@ -23794,7 +23777,7 @@
                 <w:color w:val="1C3A36"/>
                 <w:sz w:val="17"/>
               </w:rPr>
-              <w:t>5.86–8.20</w:t>
+              <w:t>5.91–7.44</w:t>
             </w:r>
           </w:p>
         </w:tc>
@@ -23812,7 +23795,7 @@
                 <w:color w:val="1C3A36"/>
                 <w:sz w:val="17"/>
               </w:rPr>
-              <w:t>Owners’ true earnings ≈ 7.8 bn; cap them fairly</w:t>
+              <w:t>Strip the FV-gain engine; pay P/B the cleaned ROAE earns</w:t>
             </w:r>
           </w:p>
         </w:tc>
@@ -23850,7 +23833,7 @@
                 <w:color w:val="1C3A36"/>
                 <w:sz w:val="17"/>
               </w:rPr>
-              <w:t>Regime scenarios</w:t>
+              <w:t>Macro-Policy state tree</w:t>
             </w:r>
           </w:p>
         </w:tc>
@@ -23868,7 +23851,7 @@
                 <w:color w:val="1C3A36"/>
                 <w:sz w:val="17"/>
               </w:rPr>
-              <w:t>7.07</w:t>
+              <w:t>7.03</w:t>
             </w:r>
           </w:p>
         </w:tc>
@@ -23886,7 +23869,7 @@
                 <w:color w:val="1C3A36"/>
                 <w:sz w:val="17"/>
               </w:rPr>
-              <w:t>5.58–8.63 (states)</w:t>
+              <w:t>5.60–8.20 (states)</w:t>
             </w:r>
           </w:p>
         </w:tc>
@@ -23904,7 +23887,7 @@
                 <w:color w:val="1C3A36"/>
                 <w:sz w:val="17"/>
               </w:rPr>
-              <w:t>Price the Gulf regime, not the spreadsheet</w:t>
+              <w:t>Price the peg, the tax glide and the war state</w:t>
             </w:r>
           </w:p>
         </w:tc>
@@ -23965,7 +23948,7 @@
                 <w:color w:val="1C3A36"/>
                 <w:sz w:val="17"/>
               </w:rPr>
-              <w:t>7.03 (median)</w:t>
+              <w:t>6.78 (median)</w:t>
             </w:r>
           </w:p>
         </w:tc>
@@ -23985,7 +23968,7 @@
                 <w:color w:val="1C3A36"/>
                 <w:sz w:val="17"/>
               </w:rPr>
-              <w:t>6.3–7.07</w:t>
+              <w:t>6.3–7.03</w:t>
             </w:r>
           </w:p>
         </w:tc>
@@ -24027,7 +24010,7 @@
           <w:color w:val="1C3A36"/>
           <w:sz w:val="19"/>
         </w:rPr>
-        <w:t>Cross-examination — each expert’s strongest objection to the other two, recorded so the reader can weigh them rather than the panel’s harmony. Expert 1 to Expert 2: capitalizing look-through earnings double-counts what the marks already price — Aldar’s 8.6× is the market’s multiple on Aldar’s earnings, so re-multiplying them inside ADH smuggles in a second opinion on Aldar; and to Expert 3: state values anchored to my NAV make the tree partly derivative of my method, not independent of it. Expert 2 to Expert 1: a discount built from governance scores is unfalsifiable — earnings are auditable, discount components are vibes with decimals; and to Expert 3: 35/40/25 is a confession that the method has no edge on the one variable it says matters most. Expert 3 to both: your numbers were equally “right” in February at AED 10 and in March at AED 7 — a valuation that cannot say which regime it assumes is not wrong, it is incomplete. The disclosed rebuttals: Expert 2’s reconciliation to reported attributable (within 2.5%) answers the double-count charge in aggregate — the wrapper’s 10.3× versus the blended parts is still a real spread; Expert 1’s component table at least makes the discount arguable line by line; and Expert 3’s weight-sensitivity table is the honesty the objection demands.</w:t>
+        <w:t>Cross-examination — each expert’s strongest objection to the other two, recorded so the reader can weigh them rather than the panel’s harmony. Expert 1 to Expert 2: a justified P/B is a discount model wearing an eyeshade — your (ROAE−g)/(Ke−g) smuggles in the same growth and cost-of-equity judgments you accuse the market of, and your book is my NAV minus the marks’ information; and to Expert 3: state values anchored to my NAV make the tree partly derivative of my method. Expert 2 to Expert 1: your discount components are vibes with decimals — my two audit findings (the derived borrowings, the dual Trojan framing) are checkable, your governance scores are not; and to Expert 3: 35/40/25 is a confession the method has no edge on the one variable it says matters most. Expert 3 to both: your numbers were equally “right” in February at AED 10 and in March at AED 7 — a valuation that cannot say which policy state it assumes is not wrong, it is incomplete; and the DMTT glide sits in neither of your base cases explicitly. The disclosed rebuttals: Expert 2’s Exhibit-1 reconciliation (within 2.5%) and named findings are exactly the checkability the objection demands; Expert 1’s component table makes the discount arguable line by line; and Expert 3’s weight-sensitivity table is the honesty his own objection requires.</w:t>
       </w:r>
     </w:p>
     <w:p>
@@ -24055,35 +24038,7 @@
           <w:color w:val="1C3A36"/>
           <w:sz w:val="19"/>
         </w:rPr>
-        <w:t>The panel’s striking feature is not divergence but convergence: three unrelated methods — a balance-sheet mark, an earnings capitalization, and a macro scenario tree — land within AED 0.8 of each other (6.3–7.07), tightly bracketing the house central of 7.30 from below. When methods that share no inputs agree, the residual disagreement with the market price is not model risk; it is the premium of §1.7, isolated. The convergence is also structurally informative about where the value lives: Expert 1 reaches ~6.3 through the balance sheet, Expert 2 reaches ~7.0 through earnings, and the two would only diverge if the book and the earnings told different stories — their agreement says the AED 60 bn parent book and the AED 7.8–8.0 bn attributable earnings stream are consistent descriptions of the same company (an implied ~13% return on the owners’ book, capitalized at 9× ≈ 1.17× book vs the 1.05–1.24× the two experts span). What would break the convergence, and in which direction: an unlisted-asset disposal above carrying value splits Expert 1 up from Expert 2 (book proven, earnings unchanged); an NMDC run-rate reset splits Expert 2 down from Expert 1 (earnings impaired, marks slower to move); and a regime resolution either way moves Expert 3 alone first — which is why §5’s catalyst list maps one-to-one onto the panel. The panel’s collective falsification condition is therefore the same as the study’s: demonstrated owner-level earnings growth plus validated residual-book value would move all three bases up together; nothing else would.</w:t>
-      </w:r>
-    </w:p>
-    <w:p>
-      <w:pPr>
-        <w:spacing w:after="120" w:before="280"/>
-      </w:pPr>
-      <w:r>
-        <w:rPr>
-          <w:b/>
-          <w:i w:val="0"/>
-          <w:color w:val="1C3A36"/>
-          <w:sz w:val="30"/>
-        </w:rPr>
-        <w:t>About this series</w:t>
-      </w:r>
-    </w:p>
-    <w:p>
-      <w:pPr>
-        <w:spacing w:after="120" w:before="0"/>
-      </w:pPr>
-      <w:r>
-        <w:rPr>
-          <w:b w:val="0"/>
-          <w:i w:val="0"/>
-          <w:color w:val="1C3A36"/>
-          <w:sz w:val="19"/>
-        </w:rPr>
-        <w:t>Testahil publishes independent, educational valuation studies as fair-value ranges and probability distributions — never ratings, price targets, or buy/sell calls. Every probabilistic forecast this platform publishes is logged, dated, and graded after the fact in a public, append-only Calibration Ledger; the Step-0 calibration gate that every study must pass before publication is recorded there, not here. Studies follow a fixed house template so that methods, not formatting, carry the differences between names.</w:t>
+        <w:t>The panel’s striking feature is not divergence but convergence: a balance-sheet mark, a cleaned-book capitalization and a policy state tree — sharing no inputs beyond the audited statements — land within AED 0.7 of each other (6.3 / 6.78 / 7.03), bracketing the house central of 7.30 from below. When methods that share no inputs agree, the residual disagreement with the market price is not model risk; it is the premium of §1.7, isolated. The convergence is also structurally informative: Expert 1 reaches ~6.3 through the marks, Expert 2 reaches ~6.8 through the cleaned book — and the two would only diverge if the marks and the book told different stories; their agreement says the AED 60 bn parent book and its ~10% cash-quality return are consistent descriptions of the same company. What would break the convergence, and in which direction: an unlisted-asset disposal above carrying value splits Expert 1 up from Expert 2 (book proven, cleaned earnings unchanged); FV gains converting to cash splits Expert 2 up (cleaned ROAE migrates toward reported); a policy resolution either way moves Expert 3 alone first — which is why §5’s catalyst list maps one-to-one onto the panel. The panel’s collective falsification condition is therefore the study’s: demonstrated owner-level cash earnings growth plus validated residual-book value would move all three bases up together; nothing else would.</w:t>
       </w:r>
     </w:p>
     <w:p>

</xml_diff>

<commit_message>
ALPHADHABI: reweight lenses 55/15/15/15 (from 45/15/25/15) — look-through cut 25%→15% on external-audit double-count flag, freed 10pts to the SOTP anchor. Weighted central 7.30→7.13 (spot -13% vs -11%); band 5.95-8.63. Rebased onto EAND publish.
</commit_message>
<xml_diff>
--- a/files/ALPHADHABI_Valuation_Study_10-07-2026_public.docx
+++ b/files/ALPHADHABI_Valuation_Study_10-07-2026_public.docx
@@ -902,7 +902,7 @@
           <w:color w:val="1C3A36"/>
           <w:sz w:val="21"/>
         </w:rPr>
-        <w:t>At AED 8.22 the shares sit about 13% above our weighted central estimate of AED 7.30, and roughly 10% above the undiscounted mark-to-market NAV of AED 7.44 — before applying any holdco discount at all. The primary lens is the sum-of-the-parts: marking the four listed stakes at exchange prices (AED 20.5 bn Aldar, 14.4 bn NMDC, 8.6 bn PureHealth, 2.4 bn NCTH), Trojan at the price ADQ actually paid for its 49% (AED 5.2 bn for ADH’s 51%), and the rest of the parent’s audited book at carrying value gives AED 74.4 bn, or 7.44/share at par and 6.32 at a 15% holdco discount. A consolidated FCFF DCF lands far higher at 11.72 — but four-fifths of it is terminal value and it credits the owners with cash that today is being swallowed by working capital (FY2025: AED 7.5 bn absorbed, roughly half of every incremental revenue dirham), so it is weighted as a ceiling, not an anchor. Look-through earnings multiples give 8.07; the stated dividend policy discounts to just 4.55, a reminder of how little of the group’s AED 15 bn profit actually leaves the holdco. The crux is concrete (§1.7): the AED 8 bn the market pays above marked NAV is a bet that IHC-ecosystem deal flow and fair-value gains keep compounding book value faster than a standalone owner could — defensible in 2023–24, harder after two straight years of falling attributable earnings. Technically the tape has bounced hard off the March war trough (RSI 64, price above the 20/50/100-day stack but still 7% below the 200-day). Over three months the Monte Carlo — carry-anchored, zero equity drift, the configuration that passed Step-0 calibration at parity — puts the 5th–95th band at AED 6.30–10.93 with the median at 8.29 and the 50% core at 7.42–9.27; the 7–8 Jul war re-escalation is a live left-tail on top of that map, not inside it.</w:t>
+        <w:t>At AED 8.22 the shares sit about 15% above our weighted central estimate of AED 7.13, and roughly 10% above the undiscounted mark-to-market NAV of AED 7.44 — before applying any holdco discount at all. The primary lens is the sum-of-the-parts: marking the four listed stakes at exchange prices (AED 20.5 bn Aldar, 14.4 bn NMDC, 8.6 bn PureHealth, 2.4 bn NCTH), Trojan at the price ADQ actually paid for its 49% (AED 5.2 bn for ADH’s 51%), and the rest of the parent’s audited book at carrying value gives AED 74.4 bn, or 7.44/share at par and 6.32 at a 15% holdco discount. A consolidated FCFF DCF lands far higher at 11.72 — but four-fifths of it is terminal value and it credits the owners with cash that today is being swallowed by working capital (FY2025: AED 7.5 bn absorbed, roughly half of every incremental revenue dirham), so it is weighted as a ceiling, not an anchor. Look-through earnings multiples give 8.07; the stated dividend policy discounts to just 4.55, a reminder of how little of the group’s AED 15 bn profit actually leaves the holdco. The crux is concrete (§1.7): the AED 8 bn the market pays above marked NAV is a bet that IHC-ecosystem deal flow and fair-value gains keep compounding book value faster than a standalone owner could — defensible in 2023–24, harder after two straight years of falling attributable earnings. Technically the tape has bounced hard off the March war trough (RSI 64, price above the 20/50/100-day stack but still 7% below the 200-day). Over three months the Monte Carlo — carry-anchored, zero equity drift, the configuration that passed Step-0 calibration at parity — puts the 5th–95th band at AED 6.30–10.93 with the median at 8.29 and the 50% core at 7.42–9.27; the 7–8 Jul war re-escalation is a live left-tail on top of that map, not inside it.</w:t>
       </w:r>
     </w:p>
     <w:p>
@@ -1440,7 +1440,7 @@
                 <w:color w:val="1C3A36"/>
                 <w:sz w:val="17"/>
               </w:rPr>
-              <w:t>Blend 45 / 15 / 25 / 15</w:t>
+              <w:t>Blend 55 / 15 / 15 / 15</w:t>
             </w:r>
           </w:p>
         </w:tc>
@@ -1458,7 +1458,7 @@
                 <w:color w:val="1C3A36"/>
                 <w:sz w:val="17"/>
               </w:rPr>
-              <w:t>AED 7.30 (6.08–8.82)</w:t>
+              <w:t>AED 7.13 (5.95–8.63)</w:t>
             </w:r>
           </w:p>
         </w:tc>
@@ -1476,7 +1476,7 @@
                 <w:color w:val="1C3A36"/>
                 <w:sz w:val="17"/>
               </w:rPr>
-              <w:t>-11% vs AED 8.22</w:t>
+              <w:t>-13% vs AED 8.22</w:t>
             </w:r>
           </w:p>
         </w:tc>
@@ -2325,7 +2325,7 @@
           <w:color w:val="1C3A36"/>
           <w:sz w:val="19"/>
         </w:rPr>
-        <w:t>Three of the four fundamental lenses — and all three independent experts — land below the AED 8.22 spot; only the consolidated DCF sits above it, and §1.2 explains why that lens flatters a holdco. The weighted central of AED 7.30 is 11% below spot. This is not a broken story — the parts are real, the listed marks are observable, book value has compounded at ~19% a year since 2023 — it is a pricing question: after the de-rating the shares still trade at roughly 1.37× the parent’s audited book and ~10% above marked NAV, levels that assume the FV-gain engine and the IHC deal pipeline keep delivering. The three-month distribution centres at spot with a mild upside tilt from the carry anchor and the post-trough tape — with the July war re-escalation as the explicit, unpriced left-tail.</w:t>
+        <w:t>Three of the four fundamental lenses — and all three independent experts — land below the AED 8.22 spot; only the consolidated DCF sits above it, and §1.2 explains why that lens flatters a holdco. The weighted central of AED 7.13 is 13% below spot. This is not a broken story — the parts are real, the listed marks are observable, book value has compounded at ~19% a year since 2023 — it is a pricing question: after the de-rating the shares still trade at roughly 1.37× the parent’s audited book and ~10% above marked NAV, levels that assume the FV-gain engine and the IHC deal pipeline keep delivering. The three-month distribution centres at spot with a mild upside tilt from the carry anchor and the post-trough tape — with the July war re-escalation as the explicit, unpriced left-tail.</w:t>
       </w:r>
     </w:p>
     <w:p>
@@ -6254,7 +6254,7 @@
                 <w:color w:val="1C3A36"/>
                 <w:sz w:val="17"/>
               </w:rPr>
-              <w:t>45%</w:t>
+              <w:t>55%</w:t>
             </w:r>
           </w:p>
         </w:tc>
@@ -6272,7 +6272,7 @@
                 <w:color w:val="1C3A36"/>
                 <w:sz w:val="17"/>
               </w:rPr>
-              <w:t>Observable marks; the honest anchor for a holdco</w:t>
+              <w:t>Observable marks; the honest anchor for a holdco — raised 45%→55% 11-07-2026 (external audit)</w:t>
             </w:r>
           </w:p>
         </w:tc>
@@ -6472,7 +6472,7 @@
                 <w:color w:val="1C3A36"/>
                 <w:sz w:val="17"/>
               </w:rPr>
-              <w:t>25%</w:t>
+              <w:t>15%</w:t>
             </w:r>
           </w:p>
         </w:tc>
@@ -6490,7 +6490,7 @@
                 <w:color w:val="1C3A36"/>
                 <w:sz w:val="17"/>
               </w:rPr>
-              <w:t>Reported-EPS basis; FV-dependence disclosed</w:t>
+              <w:t>Reported-EPS basis; cut 25%→15% 11-07-2026 — flagged double-count risk vs the marks (external audit)</w:t>
             </w:r>
           </w:p>
         </w:tc>
@@ -6640,7 +6640,7 @@
                 <w:color w:val="1C3A36"/>
                 <w:sz w:val="17"/>
               </w:rPr>
-              <w:t>6.08</w:t>
+              <w:t>5.95</w:t>
             </w:r>
           </w:p>
         </w:tc>
@@ -6660,7 +6660,7 @@
                 <w:color w:val="1C3A36"/>
                 <w:sz w:val="17"/>
               </w:rPr>
-              <w:t>7.30</w:t>
+              <w:t>7.13</w:t>
             </w:r>
           </w:p>
         </w:tc>
@@ -6680,7 +6680,7 @@
                 <w:color w:val="1C3A36"/>
                 <w:sz w:val="17"/>
               </w:rPr>
-              <w:t>8.82</w:t>
+              <w:t>8.63</w:t>
             </w:r>
           </w:p>
         </w:tc>
@@ -10183,7 +10183,7 @@
           <w:color w:val="1C3A36"/>
           <w:sz w:val="19"/>
         </w:rPr>
-        <w:t>The NAV grid doubles as the flagged-borrowings stress: because net debt is a derived figure, the ±AED 5 bn residual-book columns bound the effect of a borrowings error at roughly ±AED 0.5/share — material to the decimal, immaterial to the verdict. The two grids together bracket every fundamental read in this study between AED 5.2 and AED 17.0; the weighted central of 7.30 sits in the lower-middle of that space because the weights sit where the observable marks are.</w:t>
+        <w:t>The NAV grid doubles as the flagged-borrowings stress: because net debt is a derived figure, the ±AED 5 bn residual-book columns bound the effect of a borrowings error at roughly ±AED 0.5/share — material to the decimal, immaterial to the verdict. The two grids together bracket every fundamental read in this study between AED 5.2 and AED 17.0; the weighted central of 7.13 sits in the lower third of that space because the weights sit where the observable marks are — more so since 11-07-2026, when the look-through weight was cut from 25% to 15% (double-count risk vs the marks) and the freed 10 points moved onto the SOTP anchor (45%→55%), following an external audit.</w:t>
       </w:r>
     </w:p>
     <w:p>
@@ -11588,7 +11588,7 @@
           <w:color w:val="6E7B77"/>
           <w:sz w:val="17"/>
         </w:rPr>
-        <w:t>Figure 8 — Terminal price distribution at T+60: right-skewed as lognormal paths are, with the fundamental central (7.30) and marked NAV (7.44) both inside the left half of the 50% core.</w:t>
+        <w:t>Figure 8 — Terminal price distribution at T+60: right-skewed as lognormal paths are, with the fundamental central (7.13) and marked NAV (7.44) both inside the left half of the 50% core.</w:t>
       </w:r>
     </w:p>
     <w:p>
@@ -11602,7 +11602,7 @@
           <w:color w:val="1C3A36"/>
           <w:sz w:val="19"/>
         </w:rPr>
-        <w:t>How to hold the two horizons together: at T+20 the distribution is tight (p25–p75 = 7.73–8.79) — a month rarely resolves anything. At T+60 the core widens to 7.42–9.27, and note what sits inside it: the weighted central (7.30), par NAV (7.44), and the 200-day average (8.84) all live within the 50% band. The simulation is saying the market can travel to any of this study’s reference points within a quarter without doing anything statistically unusual.</w:t>
+        <w:t>How to hold the two horizons together: at T+20 the distribution is tight (p25–p75 = 7.73–8.79) — a month rarely resolves anything. At T+60 the core widens to 7.42–9.27, and note what sits inside it: the weighted central (7.13), par NAV (7.44), and the 200-day average (8.84) sit at or near the 50% band. The simulation is saying the market can travel to any of this study’s reference points within a quarter without doing anything statistically unusual.</w:t>
       </w:r>
     </w:p>
     <w:p>
@@ -12194,7 +12194,7 @@
                 <w:color w:val="1C3A36"/>
                 <w:sz w:val="17"/>
               </w:rPr>
-              <w:t>AED 6.08–8.82, central 7.30; par NAV 7.44</w:t>
+              <w:t>AED 5.95–8.63, central 7.13; par NAV 7.44</w:t>
             </w:r>
           </w:p>
         </w:tc>
@@ -12456,7 +12456,7 @@
           <w:color w:val="1C3A36"/>
           <w:sz w:val="19"/>
         </w:rPr>
-        <w:t>Where they agree and where they don’t: all four fundamental-family reads (three lenses plus the panel) put value below the AED 8.22 print — the disagreement is only about how far. The tape disagrees on timing: momentum since the war trough has been buyers’, and the MC accordingly gives a small edge to finishing higher over a quarter. That combination — value below, momentum above — is the classic anatomy of a premium being defended, and it resolves through §1.7’s number: either attributable earnings and deal flow re-accelerate to justify the premium, or the price completes its trip toward the marks. Verdict, in the only form this house publishes: fair value AED 6.08–8.82, central 7.30; the current price sits inside the upper half of that range and above every anchor in it. No rating, no target — a distribution and its reasons.</w:t>
+        <w:t>Where they agree and where they don’t: all four fundamental-family reads (three lenses plus the panel) put value below the AED 8.22 print — the disagreement is only about how far. The tape disagrees on timing: momentum since the war trough has been buyers’, and the MC accordingly gives a small edge to finishing higher over a quarter. That combination — value below, momentum above — is the classic anatomy of a premium being defended, and it resolves through §1.7’s number: either attributable earnings and deal flow re-accelerate to justify the premium, or the price completes its trip toward the marks. Verdict, in the only form this house publishes: fair value AED 5.95–8.63, central 7.13; the current price sits inside the upper half of that range and above every anchor in it. No rating, no target — a distribution and its reasons.</w:t>
       </w:r>
     </w:p>
     <w:p>
@@ -13218,7 +13218,7 @@
                 <w:color w:val="1C3A36"/>
                 <w:sz w:val="17"/>
               </w:rPr>
-              <w:t>The trip toward NAV-with-a-discount; §1’s central (7.30) sits at the top of this zone</w:t>
+              <w:t>The trip toward NAV-with-a-discount; §1’s central (7.13) sits just below this zone</w:t>
             </w:r>
           </w:p>
         </w:tc>
@@ -13292,7 +13292,7 @@
                 <w:color w:val="1C3A36"/>
                 <w:sz w:val="17"/>
               </w:rPr>
-              <w:t>Both fundamental anchors (7.30, 7.44) and spot live here — the premium debate unresolved</w:t>
+              <w:t>Par NAV (7.44) and spot live here — the premium debate unresolved</w:t>
             </w:r>
           </w:p>
         </w:tc>
@@ -24038,7 +24038,7 @@
           <w:color w:val="1C3A36"/>
           <w:sz w:val="19"/>
         </w:rPr>
-        <w:t>The panel’s striking feature is not divergence but convergence: a balance-sheet mark, a cleaned-book capitalization and a policy state tree — sharing no inputs beyond the audited statements — land within AED 0.7 of each other (6.3 / 6.78 / 7.03), bracketing the house central of 7.30 from below. When methods that share no inputs agree, the residual disagreement with the market price is not model risk; it is the premium of §1.7, isolated. The convergence is also structurally informative: Expert 1 reaches ~6.3 through the marks, Expert 2 reaches ~6.8 through the cleaned book — and the two would only diverge if the marks and the book told different stories; their agreement says the AED 60 bn parent book and its ~10% cash-quality return are consistent descriptions of the same company. What would break the convergence, and in which direction: an unlisted-asset disposal above carrying value splits Expert 1 up from Expert 2 (book proven, cleaned earnings unchanged); FV gains converting to cash splits Expert 2 up (cleaned ROAE migrates toward reported); a policy resolution either way moves Expert 3 alone first — which is why §5’s catalyst list maps one-to-one onto the panel. The panel’s collective falsification condition is therefore the study’s: demonstrated owner-level cash earnings growth plus validated residual-book value would move all three bases up together; nothing else would.</w:t>
+        <w:t>The panel’s striking feature is not divergence but convergence: a balance-sheet mark, a cleaned-book capitalization and a policy state tree — sharing no inputs beyond the audited statements — land within AED 0.7 of each other (6.3 / 6.78 / 7.03), bracketing the house central of 7.13 from below. When methods that share no inputs agree, the residual disagreement with the market price is not model risk; it is the premium of §1.7, isolated. The convergence is also structurally informative: Expert 1 reaches ~6.3 through the marks, Expert 2 reaches ~6.8 through the cleaned book — and the two would only diverge if the marks and the book told different stories; their agreement says the AED 60 bn parent book and its ~10% cash-quality return are consistent descriptions of the same company. What would break the convergence, and in which direction: an unlisted-asset disposal above carrying value splits Expert 1 up from Expert 2 (book proven, cleaned earnings unchanged); FV gains converting to cash splits Expert 2 up (cleaned ROAE migrates toward reported); a policy resolution either way moves Expert 3 alone first — which is why §5’s catalyst list maps one-to-one onto the panel. The panel’s collective falsification condition is therefore the study’s: demonstrated owner-level cash earnings growth plus validated residual-book value would move all three bases up together; nothing else would.</w:t>
       </w:r>
     </w:p>
     <w:p>

</xml_diff>